<commit_message>
Add mandatory Acceptable Use Policy gate
Enforce agree/disagree on the current AUP version before any other access. Adds policies.requires_gate and acknowledgements.decision/ip_address/user_agent columns, GET /policies/gate and POST /policies/gate/decision endpoints, a requireSession/requireUser middleware split, aupPending in auth responses, a full-screen AupGate frontend dialog, and tests/docs for the new flow.

Co-authored-by: Copilot <223556219+Copilot@users.noreply.github.com>
</commit_message>
<xml_diff>
--- a/docs/acceptable-use-policy.docx
+++ b/docs/acceptable-use-policy.docx
@@ -249,6 +249,19 @@
       </w:pPr>
       <w:r>
         <w:t xml:space="preserve">Read and acknowledge current policy versions that apply to your work.</w:t>
+      </w:r>
+    </w:p>
+    <w:p>
+      <w:pPr>
+        <w:pStyle w:val="ListParagraph"/>
+        <w:numPr>
+          <w:ilvl/>
+          <w:numId w:val="1"/>
+        </w:numPr>
+        <w:spacing w:after="100"/>
+      </w:pPr>
+      <w:r>
+        <w:t xml:space="preserve">This Acceptable Use Policy is mandatory: you must read it and respond Agree or Disagree immediately after signing in before you can use any other part of SinglePoint. If you disagree, your session ends immediately and you are signed out. If this policy is updated to a new version, every signed-in user — including administrators — is returned to this prompt on their next action and must respond again before continuing. Every response (agree or disagree) is permanently recorded with the version, decision, timestamp, and originating IP address; administrators can review the complete history for this policy.</w:t>
       </w:r>
     </w:p>
     <w:p>

</xml_diff>

<commit_message>
Replace Acceptable Use Policy
Update the in-app and document AUP content and migrate the legacy seeded policy to the new version.

Co-authored-by: Copilot <223556219+Copilot@users.noreply.github.com>
</commit_message>
<xml_diff>
--- a/docs/acceptable-use-policy.docx
+++ b/docs/acceptable-use-policy.docx
@@ -7,7 +7,15 @@
         <w:pStyle w:val="Title"/>
       </w:pPr>
       <w:r>
-        <w:t xml:space="preserve">Acceptable Use Policy</w:t>
+        <w:t xml:space="preserve">ACCEPTABLE USE POLICY - SinglePoint and Sallelanka Solutions systems</w:t>
+      </w:r>
+    </w:p>
+    <w:p>
+      <w:pPr>
+        <w:pStyle w:val="Heading1"/>
+      </w:pPr>
+      <w:r>
+        <w:t xml:space="preserve">1. Purpose and scope</w:t>
       </w:r>
     </w:p>
     <w:p>
@@ -15,14 +23,88 @@
         <w:spacing w:after="140"/>
       </w:pPr>
       <w:r>
-        <w:rPr>
-          <w:b/>
-          <w:bCs/>
-        </w:rPr>
-        <w:t xml:space="preserve">System:</w:t>
-      </w:r>
-      <w:r>
-        <w:t xml:space="preserve"> SinglePoint security policy and compliance application</w:t>
+        <w:t xml:space="preserve">This policy applies to everyone at Sallelanka Solutions who uses SinglePoint or accesses company or client systems: the CEO, managers, software engineers, HR staff, data science staff and administrators. Use SinglePoint and company systems only for authorised business purposes. You must read this policy and choose Agree or Disagree before you can use any other part of SinglePoint.</w:t>
+      </w:r>
+    </w:p>
+    <w:p>
+      <w:pPr>
+        <w:pStyle w:val="Heading1"/>
+      </w:pPr>
+      <w:r>
+        <w:t xml:space="preserve">2. Accounts and passwords</w:t>
+      </w:r>
+    </w:p>
+    <w:p>
+      <w:pPr>
+        <w:pStyle w:val="ListParagraph"/>
+        <w:numPr>
+          <w:ilvl/>
+          <w:numId w:val="1"/>
+        </w:numPr>
+        <w:spacing w:after="100"/>
+      </w:pPr>
+      <w:r>
+        <w:t xml:space="preserve">Every person uses their own individual account. Never share your login and never use a colleague's. The old shared developer or remote-access login is not permitted.</w:t>
+      </w:r>
+    </w:p>
+    <w:p>
+      <w:pPr>
+        <w:pStyle w:val="ListParagraph"/>
+        <w:numPr>
+          <w:ilvl/>
+          <w:numId w:val="1"/>
+        </w:numPr>
+        <w:spacing w:after="100"/>
+      </w:pPr>
+      <w:r>
+        <w:t xml:space="preserve">Passwords must be at least 12 characters and unique to this system. SinglePoint stores passwords only as bcrypt hashes.</w:t>
+      </w:r>
+    </w:p>
+    <w:p>
+      <w:pPr>
+        <w:pStyle w:val="ListParagraph"/>
+        <w:numPr>
+          <w:ilvl/>
+          <w:numId w:val="1"/>
+        </w:numPr>
+        <w:spacing w:after="100"/>
+      </w:pPr>
+      <w:r>
+        <w:t xml:space="preserve">Change your password immediately if you think it has been exposed, and report it as an incident.</w:t>
+      </w:r>
+    </w:p>
+    <w:p>
+      <w:pPr>
+        <w:pStyle w:val="ListParagraph"/>
+        <w:numPr>
+          <w:ilvl/>
+          <w:numId w:val="1"/>
+        </w:numPr>
+        <w:spacing w:after="100"/>
+      </w:pPr>
+      <w:r>
+        <w:t xml:space="preserve">Repeated failed sign-in attempts are rate-limited.</w:t>
+      </w:r>
+    </w:p>
+    <w:p>
+      <w:pPr>
+        <w:pStyle w:val="ListParagraph"/>
+        <w:numPr>
+          <w:ilvl/>
+          <w:numId w:val="1"/>
+        </w:numPr>
+        <w:spacing w:after="100"/>
+      </w:pPr>
+      <w:r>
+        <w:t xml:space="preserve">Your session ends after 30 minutes of inactivity. Sign out when you leave your device.</w:t>
+      </w:r>
+    </w:p>
+    <w:p>
+      <w:pPr>
+        <w:pStyle w:val="Heading1"/>
+      </w:pPr>
+      <w:r>
+        <w:t xml:space="preserve">3. Roles and access</w:t>
       </w:r>
     </w:p>
     <w:p>
@@ -30,14 +112,294 @@
         <w:spacing w:after="140"/>
       </w:pPr>
       <w:r>
-        <w:rPr>
-          <w:b/>
-          <w:bCs/>
-        </w:rPr>
-        <w:t xml:space="preserve">Organization:</w:t>
-      </w:r>
-      <w:r>
-        <w:t xml:space="preserve"> Sallelanka Solutions (Pvt) Ltd</w:t>
+        <w:t xml:space="preserve">You can see only what your role needs. Everyone can see their own compliance status. Managers can see compliance, incidents and sign-in events for their team. The CEO can see organisation-wide compliance and incidents. HR can see the organisation-wide compliance overview in read-only form, but not incident reports, survey answers or quiz scores. Administrators manage accounts, policies and training. Do not try to access anything beyond your role. Accounts of people who leave or change roles are deactivated or updated promptly.</w:t>
+      </w:r>
+    </w:p>
+    <w:p>
+      <w:pPr>
+        <w:pStyle w:val="Heading1"/>
+      </w:pPr>
+      <w:r>
+        <w:t xml:space="preserve">4. Remote access and client systems</w:t>
+      </w:r>
+    </w:p>
+    <w:p>
+      <w:pPr>
+        <w:pStyle w:val="ListParagraph"/>
+        <w:numPr>
+          <w:ilvl/>
+          <w:numId w:val="1"/>
+        </w:numPr>
+        <w:spacing w:after="100"/>
+      </w:pPr>
+      <w:r>
+        <w:t xml:space="preserve">Use only your own individual credentials for AnyDesk or any other remote access to client systems.</w:t>
+      </w:r>
+    </w:p>
+    <w:p>
+      <w:pPr>
+        <w:pStyle w:val="ListParagraph"/>
+        <w:numPr>
+          <w:ilvl/>
+          <w:numId w:val="1"/>
+        </w:numPr>
+        <w:spacing w:after="100"/>
+      </w:pPr>
+      <w:r>
+        <w:t xml:space="preserve">Close every remote session as soon as you finish.</w:t>
+      </w:r>
+    </w:p>
+    <w:p>
+      <w:pPr>
+        <w:pStyle w:val="ListParagraph"/>
+        <w:numPr>
+          <w:ilvl/>
+          <w:numId w:val="1"/>
+        </w:numPr>
+        <w:spacing w:after="100"/>
+      </w:pPr>
+      <w:r>
+        <w:t xml:space="preserve">Never accept an unexpected or out-of-hours connection request. Decline it and report it.</w:t>
+      </w:r>
+    </w:p>
+    <w:p>
+      <w:pPr>
+        <w:pStyle w:val="ListParagraph"/>
+        <w:numPr>
+          <w:ilvl/>
+          <w:numId w:val="1"/>
+        </w:numPr>
+        <w:spacing w:after="100"/>
+      </w:pPr>
+      <w:r>
+        <w:t xml:space="preserve">Never store or send client credentials in personal notes, WhatsApp or any other personal messaging. Use only the approved secure channel.</w:t>
+      </w:r>
+    </w:p>
+    <w:p>
+      <w:pPr>
+        <w:pStyle w:val="Heading1"/>
+      </w:pPr>
+      <w:r>
+        <w:t xml:space="preserve">5. Client and personal data</w:t>
+      </w:r>
+    </w:p>
+    <w:p>
+      <w:pPr>
+        <w:pStyle w:val="ListParagraph"/>
+        <w:numPr>
+          <w:ilvl/>
+          <w:numId w:val="1"/>
+        </w:numPr>
+        <w:spacing w:after="100"/>
+      </w:pPr>
+      <w:r>
+        <w:t xml:space="preserve">Access only the client and personal information you need for your assigned work.</w:t>
+      </w:r>
+    </w:p>
+    <w:p>
+      <w:pPr>
+        <w:pStyle w:val="ListParagraph"/>
+        <w:numPr>
+          <w:ilvl/>
+          <w:numId w:val="1"/>
+        </w:numPr>
+        <w:spacing w:after="100"/>
+      </w:pPr>
+      <w:r>
+        <w:t xml:space="preserve">Do not copy it to personal devices, personal email or messaging accounts.</w:t>
+      </w:r>
+    </w:p>
+    <w:p>
+      <w:pPr>
+        <w:pStyle w:val="ListParagraph"/>
+        <w:numPr>
+          <w:ilvl/>
+          <w:numId w:val="1"/>
+        </w:numPr>
+        <w:spacing w:after="100"/>
+      </w:pPr>
+      <w:r>
+        <w:t xml:space="preserve">HR staff keep employee records only in approved HR systems.</w:t>
+      </w:r>
+    </w:p>
+    <w:p>
+      <w:pPr>
+        <w:pStyle w:val="ListParagraph"/>
+        <w:numPr>
+          <w:ilvl/>
+          <w:numId w:val="1"/>
+        </w:numPr>
+        <w:spacing w:after="100"/>
+      </w:pPr>
+      <w:r>
+        <w:t xml:space="preserve">Data science staff classify datasets before use, anonymise personal data where possible, and do not use production personal data on personal devices or in non-production environments without approval.</w:t>
+      </w:r>
+    </w:p>
+    <w:p>
+      <w:pPr>
+        <w:pStyle w:val="ListParagraph"/>
+        <w:numPr>
+          <w:ilvl/>
+          <w:numId w:val="1"/>
+        </w:numPr>
+        <w:spacing w:after="100"/>
+      </w:pPr>
+      <w:r>
+        <w:t xml:space="preserve">Do not paste client or personal data into external AI tools or online services that the company has not approved.</w:t>
+      </w:r>
+    </w:p>
+    <w:p>
+      <w:pPr>
+        <w:pStyle w:val="ListParagraph"/>
+        <w:numPr>
+          <w:ilvl/>
+          <w:numId w:val="1"/>
+        </w:numPr>
+        <w:spacing w:after="100"/>
+      </w:pPr>
+      <w:r>
+        <w:t xml:space="preserve">Report any accidental disclosure immediately.</w:t>
+      </w:r>
+    </w:p>
+    <w:p>
+      <w:pPr>
+        <w:pStyle w:val="Heading1"/>
+      </w:pPr>
+      <w:r>
+        <w:t xml:space="preserve">6. Devices and messaging</w:t>
+      </w:r>
+    </w:p>
+    <w:p>
+      <w:pPr>
+        <w:pStyle w:val="ListParagraph"/>
+        <w:numPr>
+          <w:ilvl/>
+          <w:numId w:val="1"/>
+        </w:numPr>
+        <w:spacing w:after="100"/>
+      </w:pPr>
+      <w:r>
+        <w:t xml:space="preserve">Lock your screen when you step away.</w:t>
+      </w:r>
+    </w:p>
+    <w:p>
+      <w:pPr>
+        <w:pStyle w:val="ListParagraph"/>
+        <w:numPr>
+          <w:ilvl/>
+          <w:numId w:val="1"/>
+        </w:numPr>
+        <w:spacing w:after="100"/>
+      </w:pPr>
+      <w:r>
+        <w:t xml:space="preserve">Do not keep work credentials on personal phones or devices unless they are in approved secure storage.</w:t>
+      </w:r>
+    </w:p>
+    <w:p>
+      <w:pPr>
+        <w:pStyle w:val="ListParagraph"/>
+        <w:numPr>
+          <w:ilvl/>
+          <w:numId w:val="1"/>
+        </w:numPr>
+        <w:spacing w:after="100"/>
+      </w:pPr>
+      <w:r>
+        <w:t xml:space="preserve">Report a lost or stolen device immediately, including a personal phone that holds work credentials or saved remote-access details.</w:t>
+      </w:r>
+    </w:p>
+    <w:p>
+      <w:pPr>
+        <w:pStyle w:val="ListParagraph"/>
+        <w:numPr>
+          <w:ilvl/>
+          <w:numId w:val="1"/>
+        </w:numPr>
+        <w:spacing w:after="100"/>
+      </w:pPr>
+      <w:r>
+        <w:t xml:space="preserve">Do not use WhatsApp or other personal messaging apps to share credentials or client data.</w:t>
+      </w:r>
+    </w:p>
+    <w:p>
+      <w:pPr>
+        <w:pStyle w:val="ListParagraph"/>
+        <w:numPr>
+          <w:ilvl/>
+          <w:numId w:val="1"/>
+        </w:numPr>
+        <w:spacing w:after="100"/>
+      </w:pPr>
+      <w:r>
+        <w:t xml:space="preserve">Install only software approved for work use.</w:t>
+      </w:r>
+    </w:p>
+    <w:p>
+      <w:pPr>
+        <w:pStyle w:val="Heading1"/>
+      </w:pPr>
+      <w:r>
+        <w:t xml:space="preserve">7. Policies and training</w:t>
+      </w:r>
+    </w:p>
+    <w:p>
+      <w:pPr>
+        <w:pStyle w:val="ListParagraph"/>
+        <w:numPr>
+          <w:ilvl/>
+          <w:numId w:val="1"/>
+        </w:numPr>
+        <w:spacing w:after="100"/>
+      </w:pPr>
+      <w:r>
+        <w:t xml:space="preserve">Read and acknowledge every policy assigned to your role, and re-acknowledge it whenever it is updated.</w:t>
+      </w:r>
+    </w:p>
+    <w:p>
+      <w:pPr>
+        <w:pStyle w:val="ListParagraph"/>
+        <w:numPr>
+          <w:ilvl/>
+          <w:numId w:val="1"/>
+        </w:numPr>
+        <w:spacing w:after="100"/>
+      </w:pPr>
+      <w:r>
+        <w:t xml:space="preserve">Complete the security habits survey and the training modules assigned or recommended to you.</w:t>
+      </w:r>
+    </w:p>
+    <w:p>
+      <w:pPr>
+        <w:pStyle w:val="ListParagraph"/>
+        <w:numPr>
+          <w:ilvl/>
+          <w:numId w:val="1"/>
+        </w:numPr>
+        <w:spacing w:after="100"/>
+      </w:pPr>
+      <w:r>
+        <w:t xml:space="preserve">A quiz score of at least 70% is required to pass, and you may retry.</w:t>
+      </w:r>
+    </w:p>
+    <w:p>
+      <w:pPr>
+        <w:pStyle w:val="ListParagraph"/>
+        <w:numPr>
+          <w:ilvl/>
+          <w:numId w:val="1"/>
+        </w:numPr>
+        <w:spacing w:after="100"/>
+      </w:pPr>
+      <w:r>
+        <w:t xml:space="preserve">Policies, surveys and training left incomplete for 30 days are marked overdue, flagged on the compliance dashboard, and may trigger a reminder from your manager.</w:t>
+      </w:r>
+    </w:p>
+    <w:p>
+      <w:pPr>
+        <w:pStyle w:val="Heading1"/>
+      </w:pPr>
+      <w:r>
+        <w:t xml:space="preserve">8. Incident reporting</w:t>
       </w:r>
     </w:p>
     <w:p>
@@ -45,14 +407,7 @@
         <w:spacing w:after="140"/>
       </w:pPr>
       <w:r>
-        <w:rPr>
-          <w:b/>
-          <w:bCs/>
-        </w:rPr>
-        <w:t xml:space="preserve">Applies to:</w:t>
-      </w:r>
-      <w:r>
-        <w:t xml:space="preserve"> Staff, managers, and administrators with a SinglePoint account</w:t>
+        <w:t xml:space="preserve">Report suspicious requests, lost devices, exposed credentials and policy violations through the in-app incident form straight away. Do not just mention them in a chat. Choose the closest incident type and severity (Low, Medium, High or Critical). Managers and administrators review reports and update their status (Pending, Under Review, Resolved). Reports made in good faith will not be treated as misconduct.</w:t>
       </w:r>
     </w:p>
     <w:p>
@@ -60,7 +415,7 @@
         <w:pStyle w:val="Heading1"/>
       </w:pPr>
       <w:r>
-        <w:t xml:space="preserve">Purpose</w:t>
+        <w:t xml:space="preserve">9. Monitoring and privacy</w:t>
       </w:r>
     </w:p>
     <w:p>
@@ -68,7 +423,7 @@
         <w:spacing w:after="140"/>
       </w:pPr>
       <w:r>
-        <w:t xml:space="preserve">Use SinglePoint and company systems only for authorized business purposes. This policy describes the safeguards currently enforced by the application and the expected handling of company access and security incidents.</w:t>
+        <w:t xml:space="preserve">SinglePoint records your name, work email, role, policy decisions, training survey answers and quiz results, incident reports, and account activity including sign-in and sign-out times, failed sign-in attempts, IP address and browser or device details. Every Agree or Disagree decision on this policy is permanently recorded with the policy version, timestamp and IP address. This information is used only for security and compliance purposes. You can see your own survey answers and training progress. Management can see compliance information within the limits of their role. Ask an administrator if you want to know what is held about you.</w:t>
       </w:r>
     </w:p>
     <w:p>
@@ -76,307 +431,85 @@
         <w:pStyle w:val="Heading1"/>
       </w:pPr>
       <w:r>
-        <w:t xml:space="preserve">Accounts and passwords</w:t>
-      </w:r>
-    </w:p>
-    <w:p>
-      <w:pPr>
-        <w:pStyle w:val="ListParagraph"/>
-        <w:numPr>
-          <w:ilvl/>
-          <w:numId w:val="1"/>
-        </w:numPr>
-        <w:spacing w:after="100"/>
-      </w:pPr>
-      <w:r>
-        <w:t xml:space="preserve">Each user must access the system with their own account. Sharing accounts or passwords is not permitted.</w:t>
-      </w:r>
-    </w:p>
-    <w:p>
-      <w:pPr>
-        <w:pStyle w:val="ListParagraph"/>
-        <w:numPr>
-          <w:ilvl/>
-          <w:numId w:val="1"/>
-        </w:numPr>
-        <w:spacing w:after="100"/>
-      </w:pPr>
-      <w:r>
-        <w:t xml:space="preserve">New passwords must contain at least 12 characters and must fit within the application's 72-byte bcrypt input limit.</w:t>
-      </w:r>
-    </w:p>
-    <w:p>
-      <w:pPr>
-        <w:pStyle w:val="ListParagraph"/>
-        <w:numPr>
-          <w:ilvl/>
-          <w:numId w:val="1"/>
-        </w:numPr>
-        <w:spacing w:after="100"/>
-      </w:pPr>
-      <w:r>
-        <w:t xml:space="preserve">Passwords are stored as bcrypt hashes, not as readable passwords.</w:t>
-      </w:r>
-    </w:p>
-    <w:p>
-      <w:pPr>
-        <w:pStyle w:val="ListParagraph"/>
-        <w:numPr>
-          <w:ilvl/>
-          <w:numId w:val="1"/>
-        </w:numPr>
-        <w:spacing w:after="100"/>
-      </w:pPr>
-      <w:r>
-        <w:t xml:space="preserve">Change your password through Account security if it may have been exposed. A password change ends existing sessions and requires you to sign in again.</w:t>
-      </w:r>
-    </w:p>
-    <w:p>
-      <w:pPr>
-        <w:pStyle w:val="ListParagraph"/>
-        <w:numPr>
-          <w:ilvl/>
-          <w:numId w:val="1"/>
-        </w:numPr>
-        <w:spacing w:after="100"/>
-      </w:pPr>
-      <w:r>
-        <w:t xml:space="preserve">Administrators must deactivate accounts that no longer need access. Deactivation blocks sign-in and revokes active sessions while retaining records needed for compliance history.</w:t>
-      </w:r>
-    </w:p>
-    <w:p>
-      <w:pPr>
-        <w:pStyle w:val="Heading1"/>
-      </w:pPr>
-      <w:r>
-        <w:t xml:space="preserve">Sessions and authorized access</w:t>
-      </w:r>
-    </w:p>
-    <w:p>
-      <w:pPr>
-        <w:pStyle w:val="ListParagraph"/>
-        <w:numPr>
-          <w:ilvl/>
-          <w:numId w:val="1"/>
-        </w:numPr>
-        <w:spacing w:after="100"/>
-      </w:pPr>
-      <w:r>
-        <w:t xml:space="preserve">An authenticated session expires after 30 minutes without activity. Authenticated requests refresh the inactivity window.</w:t>
-      </w:r>
-    </w:p>
-    <w:p>
-      <w:pPr>
-        <w:pStyle w:val="ListParagraph"/>
-        <w:numPr>
-          <w:ilvl/>
-          <w:numId w:val="1"/>
-        </w:numPr>
-        <w:spacing w:after="100"/>
-      </w:pPr>
-      <w:r>
-        <w:t xml:space="preserve">Signing out revokes the current server-side session.</w:t>
-      </w:r>
-    </w:p>
-    <w:p>
-      <w:pPr>
-        <w:pStyle w:val="ListParagraph"/>
-        <w:numPr>
-          <w:ilvl/>
-          <w:numId w:val="1"/>
-        </w:numPr>
-        <w:spacing w:after="100"/>
-      </w:pPr>
-      <w:r>
-        <w:t xml:space="preserve">Staff can access their own policy, survey, training, reminder, and incident records.</w:t>
-      </w:r>
-    </w:p>
-    <w:p>
-      <w:pPr>
-        <w:pStyle w:val="ListParagraph"/>
-        <w:numPr>
-          <w:ilvl/>
-          <w:numId w:val="1"/>
-        </w:numPr>
-        <w:spacing w:after="100"/>
-      </w:pPr>
-      <w:r>
-        <w:t xml:space="preserve">Managers can review team compliance, incidents, and sign-in audit events, and can issue in-app reminders.</w:t>
-      </w:r>
-    </w:p>
-    <w:p>
-      <w:pPr>
-        <w:pStyle w:val="ListParagraph"/>
-        <w:numPr>
-          <w:ilvl/>
-          <w:numId w:val="1"/>
-        </w:numPr>
-        <w:spacing w:after="100"/>
-      </w:pPr>
-      <w:r>
-        <w:t xml:space="preserve">Administrators can manage user accounts, roles, policies, and training content, and can perform management review workflows.</w:t>
-      </w:r>
-    </w:p>
-    <w:p>
-      <w:pPr>
-        <w:pStyle w:val="ListParagraph"/>
-        <w:numPr>
-          <w:ilvl/>
-          <w:numId w:val="1"/>
-        </w:numPr>
-        <w:spacing w:after="100"/>
-      </w:pPr>
-      <w:r>
-        <w:t xml:space="preserve">Do not attempt to access another user's private survey answers or training progress.</w:t>
-      </w:r>
-    </w:p>
-    <w:p>
-      <w:pPr>
-        <w:pStyle w:val="Heading1"/>
-      </w:pPr>
-      <w:r>
-        <w:t xml:space="preserve">Policies and training</w:t>
-      </w:r>
-    </w:p>
-    <w:p>
-      <w:pPr>
-        <w:pStyle w:val="ListParagraph"/>
-        <w:numPr>
-          <w:ilvl/>
-          <w:numId w:val="1"/>
-        </w:numPr>
-        <w:spacing w:after="100"/>
-      </w:pPr>
-      <w:r>
-        <w:t xml:space="preserve">Read and acknowledge current policy versions that apply to your work.</w:t>
-      </w:r>
-    </w:p>
-    <w:p>
-      <w:pPr>
-        <w:pStyle w:val="ListParagraph"/>
-        <w:numPr>
-          <w:ilvl/>
-          <w:numId w:val="1"/>
-        </w:numPr>
-        <w:spacing w:after="100"/>
-      </w:pPr>
-      <w:r>
-        <w:t xml:space="preserve">This Acceptable Use Policy is mandatory: you must read it and respond Agree or Disagree immediately after signing in before you can use any other part of SinglePoint. If you disagree, your session ends immediately and you are signed out. If this policy is updated to a new version, every signed-in user — including administrators — is returned to this prompt on their next action and must respond again before continuing. Every response (agree or disagree) is permanently recorded with the version, decision, timestamp, and originating IP address; administrators can review the complete history for this policy.</w:t>
-      </w:r>
-    </w:p>
-    <w:p>
-      <w:pPr>
-        <w:pStyle w:val="ListParagraph"/>
-        <w:numPr>
-          <w:ilvl/>
-          <w:numId w:val="1"/>
-        </w:numPr>
-        <w:spacing w:after="100"/>
-      </w:pPr>
-      <w:r>
-        <w:t xml:space="preserve">Complete training recommended by your survey answers or required for your role.</w:t>
-      </w:r>
-    </w:p>
-    <w:p>
-      <w:pPr>
-        <w:pStyle w:val="ListParagraph"/>
-        <w:numPr>
-          <w:ilvl/>
-          <w:numId w:val="1"/>
-        </w:numPr>
-        <w:spacing w:after="100"/>
-      </w:pPr>
-      <w:r>
-        <w:t xml:space="preserve">A quiz score of at least 70% is required to pass.</w:t>
-      </w:r>
-    </w:p>
-    <w:p>
-      <w:pPr>
-        <w:pStyle w:val="ListParagraph"/>
-        <w:numPr>
-          <w:ilvl/>
-          <w:numId w:val="1"/>
-        </w:numPr>
-        <w:spacing w:after="100"/>
-      </w:pPr>
-      <w:r>
-        <w:t xml:space="preserve">Required policy acknowledgements, surveys, and training that remain incomplete for 30 days are marked overdue.</w:t>
-      </w:r>
-    </w:p>
-    <w:p>
-      <w:pPr>
-        <w:pStyle w:val="Heading1"/>
-      </w:pPr>
-      <w:r>
-        <w:t xml:space="preserve">Incident reporting and data handling</w:t>
-      </w:r>
-    </w:p>
-    <w:p>
-      <w:pPr>
-        <w:pStyle w:val="ListParagraph"/>
-        <w:numPr>
-          <w:ilvl/>
-          <w:numId w:val="1"/>
-        </w:numPr>
-        <w:spacing w:after="100"/>
-      </w:pPr>
-      <w:r>
-        <w:t xml:space="preserve">Report suspected account compromise, unexpected remote-access requests, lost devices, suspected policy violations, and other security concerns through the incident reporting feature as soon as possible.</w:t>
-      </w:r>
-    </w:p>
-    <w:p>
-      <w:pPr>
-        <w:pStyle w:val="ListParagraph"/>
-        <w:numPr>
-          <w:ilvl/>
-          <w:numId w:val="1"/>
-        </w:numPr>
-        <w:spacing w:after="100"/>
-      </w:pPr>
-      <w:r>
-        <w:t xml:space="preserve">Provide an accurate description and choose the closest severity. Managers and admins review and update incident status.</w:t>
-      </w:r>
-    </w:p>
-    <w:p>
-      <w:pPr>
-        <w:pStyle w:val="ListParagraph"/>
-        <w:numPr>
-          <w:ilvl/>
-          <w:numId w:val="1"/>
-        </w:numPr>
-        <w:spacing w:after="100"/>
-      </w:pPr>
-      <w:r>
-        <w:t xml:space="preserve">Use company and client information only as needed for assigned work. Do not put credentials or sensitive client information in personal notes or unapproved messaging channels.</w:t>
-      </w:r>
-    </w:p>
-    <w:p>
-      <w:pPr>
-        <w:pStyle w:val="ListParagraph"/>
-        <w:numPr>
-          <w:ilvl/>
-          <w:numId w:val="1"/>
-        </w:numPr>
-        <w:spacing w:after="100"/>
-      </w:pPr>
-      <w:r>
-        <w:t xml:space="preserve">SinglePoint records account identity and role, policy acknowledgements, training and survey progress, incident reports, and sign-in time, IP address, and browser/device details. Management access to compliance and incident records is role-restricted; survey answers and personal training progress remain visible only to their submitter.</w:t>
-      </w:r>
-    </w:p>
-    <w:p>
-      <w:pPr>
-        <w:pStyle w:val="Heading1"/>
-      </w:pPr>
-      <w:r>
-        <w:t xml:space="preserve">Enforcement and review</w:t>
-      </w:r>
-    </w:p>
-    <w:p>
-      <w:pPr>
-        <w:spacing w:after="140"/>
-      </w:pPr>
-      <w:r>
-        <w:t xml:space="preserve">Use of SinglePoint is subject to the organization's information-security procedures. Contact an administrator to report a concern or request help with account access. Review this policy whenever application behavior or organizational requirements change.</w:t>
+        <w:t xml:space="preserve">10. Enforcement and consequences</w:t>
+      </w:r>
+    </w:p>
+    <w:p>
+      <w:pPr>
+        <w:pStyle w:val="ListParagraph"/>
+        <w:numPr>
+          <w:ilvl/>
+          <w:numId w:val="1"/>
+        </w:numPr>
+        <w:spacing w:after="100"/>
+      </w:pPr>
+      <w:r>
+        <w:t xml:space="preserve">Compliance is monitored through the compliance dashboard, overdue flags, reminders, the sign-in audit log and incident reviews.</w:t>
+      </w:r>
+    </w:p>
+    <w:p>
+      <w:pPr>
+        <w:pStyle w:val="ListParagraph"/>
+        <w:numPr>
+          <w:ilvl/>
+          <w:numId w:val="1"/>
+        </w:numPr>
+        <w:spacing w:after="100"/>
+      </w:pPr>
+      <w:r>
+        <w:t xml:space="preserve">If you choose Disagree, your session ends immediately and you cannot use SinglePoint until you agree. Every response is recorded and administrators can review the history.</w:t>
+      </w:r>
+    </w:p>
+    <w:p>
+      <w:pPr>
+        <w:pStyle w:val="ListParagraph"/>
+        <w:numPr>
+          <w:ilvl/>
+          <w:numId w:val="1"/>
+        </w:numPr>
+        <w:spacing w:after="100"/>
+      </w:pPr>
+      <w:r>
+        <w:t xml:space="preserve">Minor or first-time lapses are handled by your manager through a reminder and coaching.</w:t>
+      </w:r>
+    </w:p>
+    <w:p>
+      <w:pPr>
+        <w:pStyle w:val="ListParagraph"/>
+        <w:numPr>
+          <w:ilvl/>
+          <w:numId w:val="1"/>
+        </w:numPr>
+        <w:spacing w:after="100"/>
+      </w:pPr>
+      <w:r>
+        <w:t xml:space="preserve">Repeated or deliberate breaches lead to a formal warning through HR and may lead to suspension of your access.</w:t>
+      </w:r>
+    </w:p>
+    <w:p>
+      <w:pPr>
+        <w:pStyle w:val="ListParagraph"/>
+        <w:numPr>
+          <w:ilvl/>
+          <w:numId w:val="1"/>
+        </w:numPr>
+        <w:spacing w:after="100"/>
+      </w:pPr>
+      <w:r>
+        <w:t xml:space="preserve">Serious breaches, such as sharing credentials, unauthorised access, or deliberately exposing client data, lead to immediate account deactivation and disciplinary action under company procedures, up to termination of employment.</w:t>
+      </w:r>
+    </w:p>
+    <w:p>
+      <w:pPr>
+        <w:pStyle w:val="ListParagraph"/>
+        <w:numPr>
+          <w:ilvl/>
+          <w:numId w:val="1"/>
+        </w:numPr>
+        <w:spacing w:after="100"/>
+      </w:pPr>
+      <w:r>
+        <w:t xml:space="preserve">This policy is reviewed at least once a year and whenever the application or the organisation changes. Each new version requires everyone to read it and agree again.</w:t>
       </w:r>
     </w:p>
     <w:sectPr>

</xml_diff>